<commit_message>
Digital Zoom (Camera configuration)
Added the ability to digital zoom in/out the live view picture (not using the Nikon internal function, but a software function) so the focus adjustment becomes more easy.
</commit_message>
<xml_diff>
--- a/docs/fotobox_dokumentation.docx
+++ b/docs/fotobox_dokumentation.docx
@@ -1545,7 +1545,7 @@
                 <w:sz w:val="19"/>
                 <w:szCs w:val="19"/>
               </w:rPr>
-              <w:t>Kamera-Menü 2.0: zweiseitiges Menü („Belichtung“: ISO, Blende, Belichtungskorrektur, Belichtungsmessfeld; „Sonstiges“: Weißabgleich, Bildqualität, Bildgröße, Aufnahmebetrieb) direkt über die bestehende USB-Verbindung anpassen (hw_camera_settings_provider.py), ohne die Kamera aus dem Gehäuse zu nehmen, Kabel zu lösen und danach neu auszurichten. Live-Vorschau läuft während der gesamten Menüzeit mit; „Speichern“ übernimmt die Werte, „Abbrechen“ stellt den beim Öffnen aktiven Stand wieder her. Gültige Werte werden live von der Kamera gelesen (abhängig vom montierten Objektiv), die Kamera sollte im Modus A (Zeitautomatik) oder M stehen.</w:t>
+              <w:t>Kamera-Menü 2.0: zweiseitiges Menü („Belichtung“: ISO, Blende, Belichtungskorrektur, Belichtungsmessfeld; „Sonstiges“: Weißabgleich, Bildqualität, Bildgröße, Aufnahmebetrieb) direkt über die bestehende USB-Verbindung anpassen (hw_camera_settings_provider.py), ohne die Kamera aus dem Gehäuse zu nehmen, Kabel zu lösen und danach neu auszurichten. Live-Vorschau läuft während der gesamten Menüzeit mit; „Speichern“ übernimmt die Werte, „Abbrechen“ stellt den beim Öffnen aktiven Stand wieder her. Gültige Werte werden live von der Kamera gelesen (abhängig vom montierten Objektiv), die Kamera sollte im Modus A (Zeitautomatik) oder M stehen. Ein Doppeltap auf das Live-Vorschau-Panel öffnet zusätzlich den Vollbild-Zoom zum Scharfstellen (siehe Kapitel „Nikon D3300“, Abschnitt „Vollbild-Zoom zum Scharfstellen (Sprint 12)“).</w:t>
             </w:r>
           </w:p>
         </w:tc>
@@ -6834,6 +6834,38 @@
           <w:szCs w:val="18"/>
         </w:rPr>
         <w:t>Info-Button (links) und LiveView-Menüdarstellung (rechts)</w:t>
+      </w:r>
+    </w:p>
+    <w:p>
+      <w:pPr>
+        <w:pStyle w:val="berschrift2"/>
+      </w:pPr>
+      <w:r>
+        <w:t>Vollbild-Zoom zum Scharfstellen (Sprint 12)</w:t>
+      </w:r>
+    </w:p>
+    <w:p>
+      <w:pPr>
+        <w:spacing w:after="160"/>
+      </w:pPr>
+      <w:r>
+        <w:t>Ein Doppeltap auf das kleine Live-Vorschau-Panel auf der Seite „Kamera-Einstellungen“ öffnet eine Vollbild-Darstellung des Live-Bilds. Unten rechts liegen die Tasten „+“ und „–“ zum Hinein- bzw. Herauszoomen (Stufen 100/150/200/300/400 %, kein Umlaufen an den Enden), unten links die Taste „Beenden“, die exakt zur zuvor geöffneten Seite (Belichtung/Sonstiges) zurückspringt und den Zoom dabei automatisch auf 100 % zurücksetzt. Zweck: erleichtert das manuelle Scharfstellen, da das kleine Live-Vorschau-Panel dafür oft zu klein ist.</w:t>
+      </w:r>
+    </w:p>
+    <w:p>
+      <w:pPr>
+        <w:spacing w:after="160"/>
+      </w:pPr>
+      <w:r>
+        <w:t>Technischer Hintergrund: Zunächst wurde versucht, die eingebaute Zoom-Lupe der Nikon Live-View-Funktion selbst zu nutzen (PTP-Eigenschaft „Live View Image Zoom Ratio“, 0xD1A3, bei der D3300 unter dem gphoto2-Konfigurationsnamen „d1a3“ erreichbar). Ein Live-Test am Pi zeigte jedoch: Das Setzen dieser Eigenschaft dauert an der D3300 ca. 10 Sekunden und blockiert währenddessen die komplette Bedienung der Fotobox, und selbst danach ändert sich der per USB abgegriffene Live-View-Bildstrom nicht sichtbar – die Zoom-Lupe wirkt offenbar nur auf die kamera-eigene Anzeige. Dieser Hardware-Weg wurde deshalb wieder verworfen (in hw_camera_settings_provider.py bewusst deaktiviert). Der Vollbild-Zoom läuft seither ausschließlich als reiner Software-Zoom: Ein zentrierter Ausschnitt des bereits übertragenen Live-Vorschau-Frames wird vergrößert dargestellt, ohne weitere Kamera-Anfrage.</w:t>
+      </w:r>
+    </w:p>
+    <w:p>
+      <w:pPr>
+        <w:spacing w:after="160"/>
+      </w:pPr>
+      <w:r>
+        <w:t>Einschränkung: Die Bildschärfe des Software-Zooms ist durch die Auflösung der Live-Vorschau begrenzt (ca. 640×424 px). Bei starkem Zoom (400 %) wird ein nur ca. 160×106 px kleiner Ausschnitt auf Vollbild hochskaliert, was unabhängig vom verwendeten Skalierungsverfahren unscharf bleibt. Das Feature hilft beim groben Ausrichten und Erkennen von Fehlfokus, ersetzt aber keine pixelgenaue Schärfe-Kontrolle.</w:t>
       </w:r>
     </w:p>
     <w:p>

</xml_diff>